<commit_message>
docs(partner): unify validation-figure style + physics typography
All 11 sweep overlays now come from one generator with one style:
SolarLab solid blue circles, SCAPS dashed red squares (matching the
report text), ceiling-excluded degenerate points kept visible as grey
open markers (previously silently skipped by the figure script), and
real sub/superscript typography on every axis (mathtext $V_{oc}$,
$J_{sc}$, $N_{D,ETL}$, cm$^{-3}$ — previously the two donor-doping
overlays carried plain-text V_oc / cm^-3 literals and a different
colour scheme). run_scaps_validation.py's own plots get the same
mathtext labels for consistency. Validation PDF + DOCX rebuilt.

Constraint: physics labels must use real sub/superscripts in all user-facing artifacts
Confidence: high
Scope-risk: narrow
</commit_message>
<xml_diff>
--- a/docs/partner/SolarLab_SCAPS_validation_2026-06-11.docx
+++ b/docs/partner/SolarLab_SCAPS_validation_2026-06-11.docx
@@ -1884,7 +1884,7 @@
       <w:r>
         <w:drawing>
           <wp:inline>
-            <wp:extent cx="5334000" cy="3733799"/>
+            <wp:extent cx="5334000" cy="3556000"/>
             <wp:effectExtent b="0" l="0" r="0" t="0"/>
             <wp:docPr descr="ETL donor doping (ND). Grey open markers: degenerate points excluded by the detailed-balance-ceiling guard." title="" id="1" name="Picture"/>
             <a:graphic>
@@ -1905,7 +1905,7 @@
                   <pic:spPr bwMode="auto">
                     <a:xfrm>
                       <a:off x="0" y="0"/>
-                      <a:ext cx="5334000" cy="3733799"/>
+                      <a:ext cx="5334000" cy="3556000"/>
                     </a:xfrm>
                     <a:prstGeom prst="rect">
                       <a:avLst/>
@@ -2274,7 +2274,7 @@
       <w:r>
         <w:drawing>
           <wp:inline>
-            <wp:extent cx="5334000" cy="3733799"/>
+            <wp:extent cx="5334000" cy="3556000"/>
             <wp:effectExtent b="0" l="0" r="0" t="0"/>
             <wp:docPr descr="PVK donor doping (ND,PVK)." title="" id="1" name="Picture"/>
             <a:graphic>
@@ -2295,7 +2295,7 @@
                   <pic:spPr bwMode="auto">
                     <a:xfrm>
                       <a:off x="0" y="0"/>
-                      <a:ext cx="5334000" cy="3733799"/>
+                      <a:ext cx="5334000" cy="3556000"/>
                     </a:xfrm>
                     <a:prstGeom prst="rect">
                       <a:avLst/>

</xml_diff>

<commit_message>
docs(partner): interface-plane closure update + Nd_ETL combined-probe result
Adds Section 5.x to the validation summary: the interface-plane closure
(commit 90c5713) measured against the corrected configuration — HTL/PVK
interface N_t unlocked 0 -> 3.6 mV (70% of SCAPS, flat under every prior
formulation across six SRV decades), CBO 77% and PVK/ETL N_t 45% preserved,
base and six sweeps unchanged. Records the negative result of the
closure + flat-band combined probe on the ETL-doping arm (still flat
-10 mV vs SCAPS +67 mV rising; 1e12 point lands in the degenerate regime)
and rewrites the outlook: the remaining opens (Nd_ETL, PVK/ETL E_t, base
offset) share a steady-state-solve dependency — the planned next step.
Replaces the outdated "adopt two-sided formulation" recommendation
(falsified earlier). PDF/DOCX rebuilt (11 pages).

Confidence: high
Scope-risk: narrow
</commit_message>
<xml_diff>
--- a/docs/partner/SolarLab_SCAPS_validation_2026-06-11.docx
+++ b/docs/partner/SolarLab_SCAPS_validation_2026-06-11.docx
@@ -3143,7 +3143,7 @@
       </w:r>
     </w:p>
     <w:bookmarkEnd w:id="35"/>
-    <w:bookmarkStart w:id="36" w:name="analysis"/>
+    <w:bookmarkStart w:id="37" w:name="analysis"/>
     <w:p>
       <w:pPr>
         <w:pStyle w:val="Heading1"/>
@@ -3792,14 +3792,13 @@
         <w:t xml:space="preserve">transfer-matrix optics retains and SCAPS idealises away; kept deliberately.</w:t>
       </w:r>
     </w:p>
-    <w:bookmarkEnd w:id="36"/>
-    <w:bookmarkStart w:id="37" w:name="conclusion-and-outlook"/>
+    <w:bookmarkStart w:id="36" w:name="X3aa82850fded9386ab9dc49f890653e3e89abad"/>
     <w:p>
       <w:pPr>
-        <w:pStyle w:val="Heading1"/>
-      </w:pPr>
-      <w:r>
-        <w:t xml:space="preserve">6. Conclusion and outlook</w:t>
+        <w:pStyle w:val="Heading2"/>
+      </w:pPr>
+      <w:r>
+        <w:t xml:space="preserve">5.x Update: interface-plane closure (2026-06-12)</w:t>
       </w:r>
     </w:p>
     <w:p>
@@ -3807,58 +3806,23 @@
         <w:pStyle w:val="FirstParagraph"/>
       </w:pPr>
       <w:r>
-        <w:t xml:space="preserve">With the effective-DOS transport correction the base operating point agrees with</w:t>
-      </w:r>
-      <w:r>
-        <w:t xml:space="preserve"> </w:t>
-      </w:r>
-      <w:r>
-        <w:t xml:space="preserve">SCAPS to −50 mV in V</w:t>
-      </w:r>
-      <w:r>
-        <w:rPr>
-          <w:vertAlign w:val="subscript"/>
-        </w:rPr>
-        <w:t xml:space="preserve">oc</w:t>
-      </w:r>
-      <w:r>
-        <w:t xml:space="preserve"> </w:t>
-      </w:r>
-      <w:r>
-        <w:t xml:space="preserve">(from −96 mV), +0.9 pp in FF, and −2 % in J</w:t>
-      </w:r>
-      <w:r>
-        <w:rPr>
-          <w:vertAlign w:val="subscript"/>
-        </w:rPr>
-        <w:t xml:space="preserve">sc</w:t>
-      </w:r>
-      <w:r>
-        <w:t xml:space="preserve">, and</w:t>
-      </w:r>
-      <w:r>
-        <w:t xml:space="preserve"> </w:t>
-      </w:r>
-      <w:r>
-        <w:t xml:space="preserve">six of the eleven parameter-sweep trends match with two partial. The three open</w:t>
-      </w:r>
-      <w:r>
-        <w:t xml:space="preserve"> </w:t>
-      </w:r>
-      <w:r>
-        <w:t xml:space="preserve">trends share a single named mechanism — the interface-recombination channel —</w:t>
-      </w:r>
-      <w:r>
-        <w:t xml:space="preserve"> </w:t>
-      </w:r>
-      <w:r>
-        <w:t xml:space="preserve">rather than being independent defects, and every physically well-posed result</w:t>
-      </w:r>
-      <w:r>
-        <w:t xml:space="preserve"> </w:t>
-      </w:r>
-      <w:r>
-        <w:t xml:space="preserve">satisfies the governing bounds. We recommend the corrected configuration</w:t>
+        <w:t xml:space="preserve">After this report’s main analysis was frozen, the named residual mechanism was</w:t>
+      </w:r>
+      <w:r>
+        <w:t xml:space="preserve"> </w:t>
+      </w:r>
+      <w:r>
+        <w:t xml:space="preserve">addressed directly: an optional</w:t>
+      </w:r>
+      <w:r>
+        <w:t xml:space="preserve"> </w:t>
+      </w:r>
+      <w:r>
+        <w:rPr>
+          <w:iCs/>
+          <w:i/>
+        </w:rPr>
+        <w:t xml:space="preserve">interface-plane closure</w:t>
       </w:r>
       <w:r>
         <w:t xml:space="preserve"> </w:t>
@@ -3870,166 +3834,40 @@
         <w:rPr>
           <w:rStyle w:val="VerbatimChar"/>
         </w:rPr>
-        <w:t xml:space="preserve">dos_band_potentials</w:t>
-      </w:r>
-      <w:r>
-        <w:t xml:space="preserve"> </w:t>
-      </w:r>
-      <w:r>
-        <w:t xml:space="preserve">on the SCAPS-mirror device) as the validated baseline.</w:t>
-      </w:r>
-      <w:r>
-        <w:t xml:space="preserve"> </w:t>
-      </w:r>
-      <w:r>
-        <w:t xml:space="preserve">The natural next step, if closer interface-sweep agreement is required, is to</w:t>
-      </w:r>
-      <w:r>
-        <w:t xml:space="preserve"> </w:t>
-      </w:r>
-      <w:r>
-        <w:t xml:space="preserve">adopt SCAPS’s two-sided interface-recombination formulation; the groundwork</w:t>
-      </w:r>
-      <w:r>
-        <w:t xml:space="preserve"> </w:t>
-      </w:r>
-      <w:r>
-        <w:t xml:space="preserve">(interface-plane projection, flat-band contacts) is already in the codebase</w:t>
-      </w:r>
-      <w:r>
-        <w:t xml:space="preserve"> </w:t>
-      </w:r>
-      <w:r>
-        <w:t xml:space="preserve">behind explicit flags.</w:t>
-      </w:r>
-    </w:p>
-    <w:bookmarkEnd w:id="37"/>
-    <w:bookmarkStart w:id="38" w:name="appendix-a-reproducibility"/>
-    <w:p>
-      <w:pPr>
-        <w:pStyle w:val="Heading1"/>
-      </w:pPr>
-      <w:r>
-        <w:t xml:space="preserve">Appendix A: Reproducibility</w:t>
-      </w:r>
-    </w:p>
-    <w:p>
-      <w:pPr>
-        <w:pStyle w:val="SourceCode"/>
-      </w:pPr>
-      <w:r>
-        <w:rPr>
-          <w:rStyle w:val="VerbatimChar"/>
-        </w:rPr>
-        <w:t xml:space="preserve">cd perovskite-sim</w:t>
-      </w:r>
-      <w:r>
-        <w:br/>
-      </w:r>
-      <w:r>
-        <w:rPr>
-          <w:rStyle w:val="VerbatimChar"/>
-        </w:rPr>
-        <w:t xml:space="preserve">SOLARLAB_DOS_BAND=1 python scripts/run_scaps_full_regression.py \</w:t>
-      </w:r>
-      <w:r>
-        <w:br/>
-      </w:r>
-      <w:r>
-        <w:rPr>
-          <w:rStyle w:val="VerbatimChar"/>
-        </w:rPr>
-        <w:t xml:space="preserve">    --out-dir outputs/full_dos_ON          # 10-sweep trend verdicts</w:t>
-      </w:r>
-      <w:r>
-        <w:br/>
-      </w:r>
-      <w:r>
-        <w:rPr>
-          <w:rStyle w:val="VerbatimChar"/>
-        </w:rPr>
-        <w:t xml:space="preserve">SOLARLAB_DOS_BAND=1 python scripts/run_scaps_validation.py \</w:t>
-      </w:r>
-      <w:r>
-        <w:br/>
-      </w:r>
-      <w:r>
-        <w:rPr>
-          <w:rStyle w:val="VerbatimChar"/>
-        </w:rPr>
-        <w:t xml:space="preserve">    --config configs/scaps_mirror_v2.yaml --out-dir outputs/dos_ON</w:t>
-      </w:r>
-      <w:r>
-        <w:br/>
-      </w:r>
-      <w:r>
-        <w:rPr>
-          <w:rStyle w:val="VerbatimChar"/>
-        </w:rPr>
-        <w:t xml:space="preserve">SOLARLAB_DOS_BAND=1 python scripts/scaps_validation_figures.py \</w:t>
-      </w:r>
-      <w:r>
-        <w:br/>
-      </w:r>
-      <w:r>
-        <w:rPr>
-          <w:rStyle w:val="VerbatimChar"/>
-        </w:rPr>
-        <w:t xml:space="preserve">    --out ../docs/figures/scaps_validation   # regenerate the overlays</w:t>
-      </w:r>
-    </w:p>
-    <w:p>
-      <w:pPr>
-        <w:pStyle w:val="FirstParagraph"/>
-      </w:pPr>
-      <w:r>
-        <w:t xml:space="preserve">Full technical detail is in</w:t>
-      </w:r>
-      <w:r>
-        <w:t xml:space="preserve"> </w:t>
-      </w:r>
-      <w:r>
-        <w:rPr>
-          <w:rStyle w:val="VerbatimChar"/>
-        </w:rPr>
-        <w:t xml:space="preserve">docs/scaps_validation_report.md</w:t>
-      </w:r>
-      <w:r>
-        <w:t xml:space="preserve">; the V</w:t>
-      </w:r>
-      <w:r>
-        <w:rPr>
-          <w:vertAlign w:val="subscript"/>
-        </w:rPr>
-        <w:t xml:space="preserve">oc</w:t>
-      </w:r>
-      <w:r>
-        <w:t xml:space="preserve"> </w:t>
-      </w:r>
-      <w:r>
-        <w:t xml:space="preserve">root-cause analysis is in</w:t>
-      </w:r>
-      <w:r>
-        <w:t xml:space="preserve"> </w:t>
-      </w:r>
-      <w:r>
-        <w:rPr>
-          <w:rStyle w:val="VerbatimChar"/>
-        </w:rPr>
-        <w:t xml:space="preserve">SolarLab_SCAPS_gap_analysis_corrected.pdf</w:t>
-      </w:r>
-      <w:r>
-        <w:t xml:space="preserve">.</w:t>
-      </w:r>
-    </w:p>
-    <w:bookmarkEnd w:id="38"/>
-    <w:bookmarkStart w:id="39" w:name="X8aeae421bbd1e89212f1b13ef0b4db982a0e6a9"/>
-    <w:p>
-      <w:pPr>
-        <w:pStyle w:val="Heading1"/>
-      </w:pPr>
-      <w:r>
-        <w:t xml:space="preserve">Appendix B: Reference results with the transport correction off</w:t>
+        <w:t xml:space="preserve">interface_plane_closure</w:t>
+      </w:r>
+      <w:r>
+        <w:t xml:space="preserve">, default off) evaluates defect-interface</w:t>
+      </w:r>
+      <w:r>
+        <w:t xml:space="preserve"> </w:t>
+      </w:r>
+      <w:r>
+        <w:t xml:space="preserve">recombination on true interface-plane carrier densities, solved per evaluation</w:t>
+      </w:r>
+      <w:r>
+        <w:t xml:space="preserve"> </w:t>
+      </w:r>
+      <w:r>
+        <w:t xml:space="preserve">from a local implicit flux balance (supply-limited; the plane gap is the</w:t>
+      </w:r>
+      <w:r>
+        <w:t xml:space="preserve"> </w:t>
+      </w:r>
+      <w:r>
+        <w:t xml:space="preserve">reduced interface gap, which carries the band-offset cliff physics; the trap</w:t>
+      </w:r>
+      <w:r>
+        <w:t xml:space="preserve"> </w:t>
+      </w:r>
+      <w:r>
+        <w:t xml:space="preserve">level is clamped to that gap). It is the fifth interface formulation attempted</w:t>
+      </w:r>
+      <w:r>
+        <w:t xml:space="preserve"> </w:t>
+      </w:r>
+      <w:r>
+        <w:t xml:space="preserve">and the first with a net-positive measured outcome:</w:t>
       </w:r>
     </w:p>
     <w:tbl>
@@ -4058,6 +3896,591 @@
               <w:jc w:val="left"/>
             </w:pPr>
             <w:r>
+              <w:t xml:space="preserve">corrected config</w:t>
+            </w:r>
+          </w:p>
+        </w:tc>
+        <w:tc>
+          <w:p>
+            <w:pPr>
+              <w:pStyle w:val="Compact"/>
+              <w:jc w:val="left"/>
+            </w:pPr>
+            <w:r>
+              <w:t xml:space="preserve">+ plane closure</w:t>
+            </w:r>
+          </w:p>
+        </w:tc>
+        <w:tc>
+          <w:p>
+            <w:pPr>
+              <w:pStyle w:val="Compact"/>
+              <w:jc w:val="left"/>
+            </w:pPr>
+            <w:r>
+              <w:t xml:space="preserve">SCAPS</w:t>
+            </w:r>
+          </w:p>
+        </w:tc>
+      </w:tr>
+      <w:tr>
+        <w:tc>
+          <w:p>
+            <w:pPr>
+              <w:pStyle w:val="Compact"/>
+              <w:jc w:val="left"/>
+            </w:pPr>
+            <w:r>
+              <w:t xml:space="preserve">HTL/PVK interface N</w:t>
+            </w:r>
+            <w:r>
+              <w:rPr>
+                <w:vertAlign w:val="subscript"/>
+              </w:rPr>
+              <w:t xml:space="preserve">t</w:t>
+            </w:r>
+          </w:p>
+        </w:tc>
+        <w:tc>
+          <w:p>
+            <w:pPr>
+              <w:pStyle w:val="Compact"/>
+              <w:jc w:val="left"/>
+            </w:pPr>
+            <w:r>
+              <w:t xml:space="preserve">0 mV (flat)</w:t>
+            </w:r>
+          </w:p>
+        </w:tc>
+        <w:tc>
+          <w:p>
+            <w:pPr>
+              <w:pStyle w:val="Compact"/>
+              <w:jc w:val="left"/>
+            </w:pPr>
+            <w:r>
+              <w:rPr>
+                <w:bCs/>
+                <w:b/>
+              </w:rPr>
+              <w:t xml:space="preserve">3.6 mV (70 %)</w:t>
+            </w:r>
+          </w:p>
+        </w:tc>
+        <w:tc>
+          <w:p>
+            <w:pPr>
+              <w:pStyle w:val="Compact"/>
+              <w:jc w:val="left"/>
+            </w:pPr>
+            <w:r>
+              <w:t xml:space="preserve">5.2 mV</w:t>
+            </w:r>
+          </w:p>
+        </w:tc>
+      </w:tr>
+      <w:tr>
+        <w:tc>
+          <w:p>
+            <w:pPr>
+              <w:pStyle w:val="Compact"/>
+              <w:jc w:val="left"/>
+            </w:pPr>
+            <w:r>
+              <w:t xml:space="preserve">ETL/PVK band offset</w:t>
+            </w:r>
+          </w:p>
+        </w:tc>
+        <w:tc>
+          <w:p>
+            <w:pPr>
+              <w:pStyle w:val="Compact"/>
+              <w:jc w:val="left"/>
+            </w:pPr>
+            <w:r>
+              <w:t xml:space="preserve">734 mV (80 %)</w:t>
+            </w:r>
+          </w:p>
+        </w:tc>
+        <w:tc>
+          <w:p>
+            <w:pPr>
+              <w:pStyle w:val="Compact"/>
+              <w:jc w:val="left"/>
+            </w:pPr>
+            <w:r>
+              <w:t xml:space="preserve">707 mV (77 %)</w:t>
+            </w:r>
+          </w:p>
+        </w:tc>
+        <w:tc>
+          <w:p>
+            <w:pPr>
+              <w:pStyle w:val="Compact"/>
+              <w:jc w:val="left"/>
+            </w:pPr>
+            <w:r>
+              <w:t xml:space="preserve">918 mV</w:t>
+            </w:r>
+          </w:p>
+        </w:tc>
+      </w:tr>
+      <w:tr>
+        <w:tc>
+          <w:p>
+            <w:pPr>
+              <w:pStyle w:val="Compact"/>
+              <w:jc w:val="left"/>
+            </w:pPr>
+            <w:r>
+              <w:t xml:space="preserve">PVK/ETL interface N</w:t>
+            </w:r>
+            <w:r>
+              <w:rPr>
+                <w:vertAlign w:val="subscript"/>
+              </w:rPr>
+              <w:t xml:space="preserve">t</w:t>
+            </w:r>
+          </w:p>
+        </w:tc>
+        <w:tc>
+          <w:p>
+            <w:pPr>
+              <w:pStyle w:val="Compact"/>
+              <w:jc w:val="left"/>
+            </w:pPr>
+            <w:r>
+              <w:t xml:space="preserve">149 mV (53 %)</w:t>
+            </w:r>
+          </w:p>
+        </w:tc>
+        <w:tc>
+          <w:p>
+            <w:pPr>
+              <w:pStyle w:val="Compact"/>
+              <w:jc w:val="left"/>
+            </w:pPr>
+            <w:r>
+              <w:t xml:space="preserve">127 mV (45 %)</w:t>
+            </w:r>
+          </w:p>
+        </w:tc>
+        <w:tc>
+          <w:p>
+            <w:pPr>
+              <w:pStyle w:val="Compact"/>
+              <w:jc w:val="left"/>
+            </w:pPr>
+            <w:r>
+              <w:t xml:space="preserve">282 mV</w:t>
+            </w:r>
+          </w:p>
+        </w:tc>
+      </w:tr>
+      <w:tr>
+        <w:tc>
+          <w:p>
+            <w:pPr>
+              <w:pStyle w:val="Compact"/>
+              <w:jc w:val="left"/>
+            </w:pPr>
+            <w:r>
+              <w:t xml:space="preserve">base V</w:t>
+            </w:r>
+            <w:r>
+              <w:rPr>
+                <w:vertAlign w:val="subscript"/>
+              </w:rPr>
+              <w:t xml:space="preserve">oc</w:t>
+            </w:r>
+            <w:r>
+              <w:t xml:space="preserve"> </w:t>
+            </w:r>
+            <w:r>
+              <w:t xml:space="preserve">/ other sweeps</w:t>
+            </w:r>
+          </w:p>
+        </w:tc>
+        <w:tc>
+          <w:p>
+            <w:pPr>
+              <w:pStyle w:val="Compact"/>
+              <w:jc w:val="left"/>
+            </w:pPr>
+            <w:r>
+              <w:t xml:space="preserve">—</w:t>
+            </w:r>
+          </w:p>
+        </w:tc>
+        <w:tc>
+          <w:p>
+            <w:pPr>
+              <w:pStyle w:val="Compact"/>
+              <w:jc w:val="left"/>
+            </w:pPr>
+            <w:r>
+              <w:t xml:space="preserve">unchanged</w:t>
+            </w:r>
+          </w:p>
+        </w:tc>
+        <w:tc>
+          <w:p>
+            <w:pPr>
+              <w:pStyle w:val="Compact"/>
+              <w:jc w:val="left"/>
+            </w:pPr>
+            <w:r>
+              <w:t xml:space="preserve">—</w:t>
+            </w:r>
+          </w:p>
+        </w:tc>
+      </w:tr>
+    </w:tbl>
+    <w:p>
+      <w:pPr>
+        <w:pStyle w:val="BodyText"/>
+      </w:pPr>
+      <w:r>
+        <w:t xml:space="preserve">The HTL/PVK interface — flat in SolarLab under every previous formulation</w:t>
+      </w:r>
+      <w:r>
+        <w:t xml:space="preserve"> </w:t>
+      </w:r>
+      <w:r>
+        <w:t xml:space="preserve">across six decades of surface-recombination velocity — now reproduces 70 % of</w:t>
+      </w:r>
+      <w:r>
+        <w:t xml:space="preserve"> </w:t>
+      </w:r>
+      <w:r>
+        <w:t xml:space="preserve">SCAPS’s response, at a small cost in the two large interface sweeps and no</w:t>
+      </w:r>
+      <w:r>
+        <w:t xml:space="preserve"> </w:t>
+      </w:r>
+      <w:r>
+        <w:t xml:space="preserve">change elsewhere. A combined probe (closure + flat-band contacts) did</w:t>
+      </w:r>
+      <w:r>
+        <w:t xml:space="preserve"> </w:t>
+      </w:r>
+      <w:r>
+        <w:rPr>
+          <w:iCs/>
+          <w:i/>
+        </w:rPr>
+        <w:t xml:space="preserve">not</w:t>
+      </w:r>
+      <w:r>
+        <w:t xml:space="preserve"> </w:t>
+      </w:r>
+      <w:r>
+        <w:t xml:space="preserve">recover the ETL-doping rising arm, confirming that sweep, the PVK/ETL trap</w:t>
+      </w:r>
+      <w:r>
+        <w:t xml:space="preserve"> </w:t>
+      </w:r>
+      <w:r>
+        <w:t xml:space="preserve">energy, and the residual base offset as the remaining open items; their</w:t>
+      </w:r>
+      <w:r>
+        <w:t xml:space="preserve"> </w:t>
+      </w:r>
+      <w:r>
+        <w:t xml:space="preserve">common dependency is a direct steady-state solve, which is the planned next</w:t>
+      </w:r>
+      <w:r>
+        <w:t xml:space="preserve"> </w:t>
+      </w:r>
+      <w:r>
+        <w:t xml:space="preserve">step.</w:t>
+      </w:r>
+    </w:p>
+    <w:bookmarkEnd w:id="36"/>
+    <w:bookmarkEnd w:id="37"/>
+    <w:bookmarkStart w:id="38" w:name="conclusion-and-outlook"/>
+    <w:p>
+      <w:pPr>
+        <w:pStyle w:val="Heading1"/>
+      </w:pPr>
+      <w:r>
+        <w:t xml:space="preserve">6. Conclusion and outlook</w:t>
+      </w:r>
+    </w:p>
+    <w:p>
+      <w:pPr>
+        <w:pStyle w:val="FirstParagraph"/>
+      </w:pPr>
+      <w:r>
+        <w:t xml:space="preserve">With the effective-DOS transport correction the base operating point agrees with</w:t>
+      </w:r>
+      <w:r>
+        <w:t xml:space="preserve"> </w:t>
+      </w:r>
+      <w:r>
+        <w:t xml:space="preserve">SCAPS to −50 mV in V</w:t>
+      </w:r>
+      <w:r>
+        <w:rPr>
+          <w:vertAlign w:val="subscript"/>
+        </w:rPr>
+        <w:t xml:space="preserve">oc</w:t>
+      </w:r>
+      <w:r>
+        <w:t xml:space="preserve"> </w:t>
+      </w:r>
+      <w:r>
+        <w:t xml:space="preserve">(from −96 mV), +0.9 pp in FF, and −2 % in J</w:t>
+      </w:r>
+      <w:r>
+        <w:rPr>
+          <w:vertAlign w:val="subscript"/>
+        </w:rPr>
+        <w:t xml:space="preserve">sc</w:t>
+      </w:r>
+      <w:r>
+        <w:t xml:space="preserve">, and</w:t>
+      </w:r>
+      <w:r>
+        <w:t xml:space="preserve"> </w:t>
+      </w:r>
+      <w:r>
+        <w:t xml:space="preserve">six of the eleven parameter-sweep trends match with two partial. The three open</w:t>
+      </w:r>
+      <w:r>
+        <w:t xml:space="preserve"> </w:t>
+      </w:r>
+      <w:r>
+        <w:t xml:space="preserve">trends share a single named mechanism — the interface-recombination channel —</w:t>
+      </w:r>
+      <w:r>
+        <w:t xml:space="preserve"> </w:t>
+      </w:r>
+      <w:r>
+        <w:t xml:space="preserve">rather than being independent defects, and every physically well-posed result</w:t>
+      </w:r>
+      <w:r>
+        <w:t xml:space="preserve"> </w:t>
+      </w:r>
+      <w:r>
+        <w:t xml:space="preserve">satisfies the governing bounds. We recommend the corrected configuration</w:t>
+      </w:r>
+      <w:r>
+        <w:t xml:space="preserve"> </w:t>
+      </w:r>
+      <w:r>
+        <w:t xml:space="preserve">(</w:t>
+      </w:r>
+      <w:r>
+        <w:rPr>
+          <w:rStyle w:val="VerbatimChar"/>
+        </w:rPr>
+        <w:t xml:space="preserve">dos_band_potentials</w:t>
+      </w:r>
+      <w:r>
+        <w:t xml:space="preserve"> </w:t>
+      </w:r>
+      <w:r>
+        <w:t xml:space="preserve">on the SCAPS-mirror device) as the validated baseline.</w:t>
+      </w:r>
+      <w:r>
+        <w:t xml:space="preserve"> </w:t>
+      </w:r>
+      <w:r>
+        <w:t xml:space="preserve">The first structural step toward closing it — the interface-plane closure of</w:t>
+      </w:r>
+      <w:r>
+        <w:t xml:space="preserve"> </w:t>
+      </w:r>
+      <w:r>
+        <w:t xml:space="preserve">Section 5.x — is now in the codebase behind an explicit flag and improves the</w:t>
+      </w:r>
+      <w:r>
+        <w:t xml:space="preserve"> </w:t>
+      </w:r>
+      <w:r>
+        <w:t xml:space="preserve">HTL/PVK interface response from flat to 70 % of SCAPS without degrading any</w:t>
+      </w:r>
+      <w:r>
+        <w:t xml:space="preserve"> </w:t>
+      </w:r>
+      <w:r>
+        <w:t xml:space="preserve">matched trend. The remaining open items (ETL-doping arm, PVK/ETL trap-energy</w:t>
+      </w:r>
+      <w:r>
+        <w:t xml:space="preserve"> </w:t>
+      </w:r>
+      <w:r>
+        <w:t xml:space="preserve">magnitude, residual base offset) share a dependency on a direct steady-state</w:t>
+      </w:r>
+      <w:r>
+        <w:t xml:space="preserve"> </w:t>
+      </w:r>
+      <w:r>
+        <w:t xml:space="preserve">solve, which is the planned next step; the transient ion-migration capability</w:t>
+      </w:r>
+      <w:r>
+        <w:t xml:space="preserve"> </w:t>
+      </w:r>
+      <w:r>
+        <w:t xml:space="preserve">is unaffected throughout.</w:t>
+      </w:r>
+    </w:p>
+    <w:bookmarkEnd w:id="38"/>
+    <w:bookmarkStart w:id="39" w:name="appendix-a-reproducibility"/>
+    <w:p>
+      <w:pPr>
+        <w:pStyle w:val="Heading1"/>
+      </w:pPr>
+      <w:r>
+        <w:t xml:space="preserve">Appendix A: Reproducibility</w:t>
+      </w:r>
+    </w:p>
+    <w:p>
+      <w:pPr>
+        <w:pStyle w:val="SourceCode"/>
+      </w:pPr>
+      <w:r>
+        <w:rPr>
+          <w:rStyle w:val="VerbatimChar"/>
+        </w:rPr>
+        <w:t xml:space="preserve">cd perovskite-sim</w:t>
+      </w:r>
+      <w:r>
+        <w:br/>
+      </w:r>
+      <w:r>
+        <w:rPr>
+          <w:rStyle w:val="VerbatimChar"/>
+        </w:rPr>
+        <w:t xml:space="preserve">SOLARLAB_DOS_BAND=1 python scripts/run_scaps_full_regression.py \</w:t>
+      </w:r>
+      <w:r>
+        <w:br/>
+      </w:r>
+      <w:r>
+        <w:rPr>
+          <w:rStyle w:val="VerbatimChar"/>
+        </w:rPr>
+        <w:t xml:space="preserve">    --out-dir outputs/full_dos_ON          # 10-sweep trend verdicts</w:t>
+      </w:r>
+      <w:r>
+        <w:br/>
+      </w:r>
+      <w:r>
+        <w:rPr>
+          <w:rStyle w:val="VerbatimChar"/>
+        </w:rPr>
+        <w:t xml:space="preserve">SOLARLAB_DOS_BAND=1 python scripts/run_scaps_validation.py \</w:t>
+      </w:r>
+      <w:r>
+        <w:br/>
+      </w:r>
+      <w:r>
+        <w:rPr>
+          <w:rStyle w:val="VerbatimChar"/>
+        </w:rPr>
+        <w:t xml:space="preserve">    --config configs/scaps_mirror_v2.yaml --out-dir outputs/dos_ON</w:t>
+      </w:r>
+      <w:r>
+        <w:br/>
+      </w:r>
+      <w:r>
+        <w:rPr>
+          <w:rStyle w:val="VerbatimChar"/>
+        </w:rPr>
+        <w:t xml:space="preserve">SOLARLAB_DOS_BAND=1 python scripts/scaps_validation_figures.py \</w:t>
+      </w:r>
+      <w:r>
+        <w:br/>
+      </w:r>
+      <w:r>
+        <w:rPr>
+          <w:rStyle w:val="VerbatimChar"/>
+        </w:rPr>
+        <w:t xml:space="preserve">    --out ../docs/figures/scaps_validation   # regenerate the overlays</w:t>
+      </w:r>
+    </w:p>
+    <w:p>
+      <w:pPr>
+        <w:pStyle w:val="FirstParagraph"/>
+      </w:pPr>
+      <w:r>
+        <w:t xml:space="preserve">Full technical detail is in</w:t>
+      </w:r>
+      <w:r>
+        <w:t xml:space="preserve"> </w:t>
+      </w:r>
+      <w:r>
+        <w:rPr>
+          <w:rStyle w:val="VerbatimChar"/>
+        </w:rPr>
+        <w:t xml:space="preserve">docs/scaps_validation_report.md</w:t>
+      </w:r>
+      <w:r>
+        <w:t xml:space="preserve">; the V</w:t>
+      </w:r>
+      <w:r>
+        <w:rPr>
+          <w:vertAlign w:val="subscript"/>
+        </w:rPr>
+        <w:t xml:space="preserve">oc</w:t>
+      </w:r>
+      <w:r>
+        <w:t xml:space="preserve"> </w:t>
+      </w:r>
+      <w:r>
+        <w:t xml:space="preserve">root-cause analysis is in</w:t>
+      </w:r>
+      <w:r>
+        <w:t xml:space="preserve"> </w:t>
+      </w:r>
+      <w:r>
+        <w:rPr>
+          <w:rStyle w:val="VerbatimChar"/>
+        </w:rPr>
+        <w:t xml:space="preserve">SolarLab_SCAPS_gap_analysis_corrected.pdf</w:t>
+      </w:r>
+      <w:r>
+        <w:t xml:space="preserve">.</w:t>
+      </w:r>
+    </w:p>
+    <w:bookmarkEnd w:id="39"/>
+    <w:bookmarkStart w:id="40" w:name="X8aeae421bbd1e89212f1b13ef0b4db982a0e6a9"/>
+    <w:p>
+      <w:pPr>
+        <w:pStyle w:val="Heading1"/>
+      </w:pPr>
+      <w:r>
+        <w:t xml:space="preserve">Appendix B: Reference results with the transport correction off</w:t>
+      </w:r>
+    </w:p>
+    <w:tbl>
+      <w:tblPr>
+        <w:tblStyle w:val="Table"/>
+        <w:tblW w:type="pct" w:w="0.0"/>
+        <w:tblLook w:firstRow="1" w:lastRow="0" w:firstColumn="0" w:lastColumn="0" w:noHBand="0" w:noVBand="0" w:val="0020"/>
+      </w:tblPr>
+      <w:tblGrid/>
+      <w:tr>
+        <w:tc>
+          <w:p>
+            <w:pPr>
+              <w:pStyle w:val="Compact"/>
+              <w:jc w:val="left"/>
+            </w:pPr>
+            <w:r>
+              <w:t xml:space="preserve">Sweep</w:t>
+            </w:r>
+          </w:p>
+        </w:tc>
+        <w:tc>
+          <w:p>
+            <w:pPr>
+              <w:pStyle w:val="Compact"/>
+              <w:jc w:val="left"/>
+            </w:pPr>
+            <w:r>
               <w:t xml:space="preserve">SolarLab range (off)</w:t>
             </w:r>
           </w:p>
@@ -4611,7 +5034,7 @@
         <w:t xml:space="preserve">corrected-configuration 4 mV (Table 2) is the physically consistent value.</w:t>
       </w:r>
     </w:p>
-    <w:bookmarkEnd w:id="39"/>
+    <w:bookmarkEnd w:id="40"/>
     <w:sectPr/>
   </w:body>
 </w:document>

</xml_diff>

<commit_message>
docs(partner): label §4 figures + Table 2 as faithful-default mode, cross-ref §5.z emulation deltas
The 11 sweep figures and Table 2 show the faithful-default mode (base
1.118 V); the SCAPS-emulation mode of §5.z tightens the magnitudes and
matches the base. Explicit mode labels added to the §4 intro and Table 2
caption so a reader cannot conflate the two modes' numbers. Figures
unchanged (faithful is the correct primary view); PDF/DOCX rebuilt.
</commit_message>
<xml_diff>
--- a/docs/partner/SolarLab_SCAPS_validation_2026-06-11.docx
+++ b/docs/partner/SolarLab_SCAPS_validation_2026-06-11.docx
@@ -1379,13 +1379,121 @@
         <w:t xml:space="preserve"> </w:t>
       </w:r>
       <w:r>
-        <w:t xml:space="preserve">(dashed red), four figures of merit per panel, all in the corrected</w:t>
-      </w:r>
-      <w:r>
-        <w:t xml:space="preserve"> </w:t>
-      </w:r>
-      <w:r>
-        <w:t xml:space="preserve">configuration. Grouped by outcome:</w:t>
+        <w:t xml:space="preserve">(dashed red), four figures of merit per panel.</w:t>
+      </w:r>
+      <w:r>
+        <w:t xml:space="preserve"> </w:t>
+      </w:r>
+      <w:r>
+        <w:rPr>
+          <w:bCs/>
+          <w:b/>
+        </w:rPr>
+        <w:t xml:space="preserve">All figures and the Table 2</w:t>
+      </w:r>
+      <w:r>
+        <w:rPr>
+          <w:bCs/>
+          <w:b/>
+        </w:rPr>
+        <w:t xml:space="preserve"> </w:t>
+      </w:r>
+      <w:r>
+        <w:rPr>
+          <w:bCs/>
+          <w:b/>
+        </w:rPr>
+        <w:t xml:space="preserve">scorecard below are the faithful-default mode</w:t>
+      </w:r>
+      <w:r>
+        <w:t xml:space="preserve"> </w:t>
+      </w:r>
+      <w:r>
+        <w:t xml:space="preserve">(</w:t>
+      </w:r>
+      <w:r>
+        <w:rPr>
+          <w:rStyle w:val="VerbatimChar"/>
+        </w:rPr>
+        <w:t xml:space="preserve">dos_band_potentials</w:t>
+      </w:r>
+      <w:r>
+        <w:t xml:space="preserve">, base</w:t>
+      </w:r>
+      <w:r>
+        <w:t xml:space="preserve"> </w:t>
+      </w:r>
+      <w:r>
+        <w:t xml:space="preserve">V</w:t>
+      </w:r>
+      <w:r>
+        <w:rPr>
+          <w:vertAlign w:val="subscript"/>
+        </w:rPr>
+        <w:t xml:space="preserve">oc</w:t>
+      </w:r>
+      <w:r>
+        <w:t xml:space="preserve"> </w:t>
+      </w:r>
+      <w:r>
+        <w:t xml:space="preserve">1.118 V — the device-realistic value of Section 5.z); the SCAPS-emulation</w:t>
+      </w:r>
+      <w:r>
+        <w:t xml:space="preserve"> </w:t>
+      </w:r>
+      <w:r>
+        <w:t xml:space="preserve">mode (</w:t>
+      </w:r>
+      <w:r>
+        <w:rPr>
+          <w:rStyle w:val="VerbatimChar"/>
+        </w:rPr>
+        <w:t xml:space="preserve">het_recomb_despike</w:t>
+      </w:r>
+      <w:r>
+        <w:t xml:space="preserve">, Section 5.z) shifts the base to SCAPS’s 1.168 V and</w:t>
+      </w:r>
+      <w:r>
+        <w:t xml:space="preserve"> </w:t>
+      </w:r>
+      <w:r>
+        <w:t xml:space="preserve">tightens the trend magnitudes as tabulated there (e.g. CBO 80 to 85 %, bulk</w:t>
+      </w:r>
+      <w:r>
+        <w:t xml:space="preserve"> </w:t>
+      </w:r>
+      <w:r>
+        <w:t xml:space="preserve">N</w:t>
+      </w:r>
+      <w:r>
+        <w:rPr>
+          <w:vertAlign w:val="subscript"/>
+        </w:rPr>
+        <w:t xml:space="preserve">t</w:t>
+      </w:r>
+      <w:r>
+        <w:t xml:space="preserve"> </w:t>
+      </w:r>
+      <w:r>
+        <w:t xml:space="preserve">11 to 69 %, interface N</w:t>
+      </w:r>
+      <w:r>
+        <w:rPr>
+          <w:vertAlign w:val="subscript"/>
+        </w:rPr>
+        <w:t xml:space="preserve">t</w:t>
+      </w:r>
+      <w:r>
+        <w:t xml:space="preserve"> </w:t>
+      </w:r>
+      <w:r>
+        <w:t xml:space="preserve">53 to 72 %) without changing any sweep</w:t>
+      </w:r>
+      <w:r>
+        <w:t xml:space="preserve"> </w:t>
+      </w:r>
+      <w:r>
+        <w:t xml:space="preserve">direction. Grouped by outcome (faithful default):</w:t>
       </w:r>
     </w:p>
     <w:p>
@@ -3121,7 +3229,23 @@
         <w:pStyle w:val="BodyText"/>
       </w:pPr>
       <w:r>
-        <w:t xml:space="preserve">Table 2. Per-sweep scorecard, corrected configuration (V</w:t>
+        <w:t xml:space="preserve">Table 2. Per-sweep scorecard,</w:t>
+      </w:r>
+      <w:r>
+        <w:t xml:space="preserve"> </w:t>
+      </w:r>
+      <w:r>
+        <w:rPr>
+          <w:bCs/>
+          <w:b/>
+        </w:rPr>
+        <w:t xml:space="preserve">faithful-default mode</w:t>
+      </w:r>
+      <w:r>
+        <w:t xml:space="preserve"> </w:t>
+      </w:r>
+      <w:r>
+        <w:t xml:space="preserve">(V</w:t>
       </w:r>
       <w:r>
         <w:rPr>
@@ -3139,7 +3263,55 @@
         <w:t xml:space="preserve"> </w:t>
       </w:r>
       <w:r>
-        <w:t xml:space="preserve">physically well-posed points).</w:t>
+        <w:t xml:space="preserve">physically well-posed points). The SCAPS-emulation mode of Section 5.z tightens</w:t>
+      </w:r>
+      <w:r>
+        <w:t xml:space="preserve"> </w:t>
+      </w:r>
+      <w:r>
+        <w:t xml:space="preserve">these magnitudes (CBO 85 %, bulk N</w:t>
+      </w:r>
+      <w:r>
+        <w:rPr>
+          <w:vertAlign w:val="subscript"/>
+        </w:rPr>
+        <w:t xml:space="preserve">t</w:t>
+      </w:r>
+      <w:r>
+        <w:t xml:space="preserve"> </w:t>
+      </w:r>
+      <w:r>
+        <w:t xml:space="preserve">69 %, interface N</w:t>
+      </w:r>
+      <w:r>
+        <w:rPr>
+          <w:vertAlign w:val="subscript"/>
+        </w:rPr>
+        <w:t xml:space="preserve">t</w:t>
+      </w:r>
+      <w:r>
+        <w:t xml:space="preserve"> </w:t>
+      </w:r>
+      <w:r>
+        <w:t xml:space="preserve">72 %) and matches the</w:t>
+      </w:r>
+      <w:r>
+        <w:t xml:space="preserve"> </w:t>
+      </w:r>
+      <w:r>
+        <w:t xml:space="preserve">base V</w:t>
+      </w:r>
+      <w:r>
+        <w:rPr>
+          <w:vertAlign w:val="subscript"/>
+        </w:rPr>
+        <w:t xml:space="preserve">oc</w:t>
+      </w:r>
+      <w:r>
+        <w:t xml:space="preserve"> </w:t>
+      </w:r>
+      <w:r>
+        <w:t xml:space="preserve">to within 1 mV; all sweep directions are identical in both modes.</w:t>
       </w:r>
     </w:p>
     <w:bookmarkEnd w:id="35"/>

</xml_diff>

<commit_message>
docs(partner): §5.z all-11-directions result via interface-plane states
Adds the measured directional recovery: the two interface-doping sweeps
(ETL doping, HTL/PVK N_t) reverse/flatten on the fast transient path
(bulk-node interface sampling) but recover the correct direction through
the steady-state driver with interface-plane carrier states — ETL doping
+105 mV rising (SCAPS +48), HTL/PVK -29 mV dropping (SCAPS -5). With the
plane states active all eleven sweep directions reproduce SCAPS; the two
recovered sweeps over-respond in magnitude (plane carrier-density
calibration, the named residual). PDF/DOCX rebuilt.
</commit_message>
<xml_diff>
--- a/docs/partner/SolarLab_SCAPS_validation_2026-06-11.docx
+++ b/docs/partner/SolarLab_SCAPS_validation_2026-06-11.docx
@@ -5256,7 +5256,83 @@
         <w:pStyle w:val="BodyText"/>
       </w:pPr>
       <w:r>
-        <w:t xml:space="preserve">The</w:t>
+        <w:t xml:space="preserve">Two of the eleven sweeps — ETL donor doping and the HTL/PVK interface</w:t>
+      </w:r>
+      <w:r>
+        <w:t xml:space="preserve"> </w:t>
+      </w:r>
+      <w:r>
+        <w:t xml:space="preserve">defect density — reverse or flatten in</w:t>
+      </w:r>
+      <w:r>
+        <w:t xml:space="preserve"> </w:t>
+      </w:r>
+      <w:r>
+        <w:rPr>
+          <w:iCs/>
+          <w:i/>
+        </w:rPr>
+        <w:t xml:space="preserve">direction</w:t>
+      </w:r>
+      <w:r>
+        <w:t xml:space="preserve"> </w:t>
+      </w:r>
+      <w:r>
+        <w:t xml:space="preserve">on the fast transient path,</w:t>
+      </w:r>
+      <w:r>
+        <w:t xml:space="preserve"> </w:t>
+      </w:r>
+      <w:r>
+        <w:t xml:space="preserve">because that path samples interface recombination at bulk grid nodes rather</w:t>
+      </w:r>
+      <w:r>
+        <w:t xml:space="preserve"> </w:t>
+      </w:r>
+      <w:r>
+        <w:t xml:space="preserve">than the interface plane. Routing those sweeps through the steady-state driver</w:t>
+      </w:r>
+      <w:r>
+        <w:t xml:space="preserve"> </w:t>
+      </w:r>
+      <w:r>
+        <w:t xml:space="preserve">with explicit interface-plane carrier states recovers the correct direction:</w:t>
+      </w:r>
+      <w:r>
+        <w:t xml:space="preserve"> </w:t>
+      </w:r>
+      <w:r>
+        <w:t xml:space="preserve">the ETL-doping V</w:t>
+      </w:r>
+      <w:r>
+        <w:rPr>
+          <w:vertAlign w:val="subscript"/>
+        </w:rPr>
+        <w:t xml:space="preserve">oc</w:t>
+      </w:r>
+      <w:r>
+        <w:t xml:space="preserve"> </w:t>
+      </w:r>
+      <w:r>
+        <w:t xml:space="preserve">rises with doping (+105 mV measured versus SCAPS’s +48,</w:t>
+      </w:r>
+      <w:r>
+        <w:t xml:space="preserve"> </w:t>
+      </w:r>
+      <w:r>
+        <w:t xml:space="preserve">direction matched) and the HTL/PVK interface response drops with defect density</w:t>
+      </w:r>
+      <w:r>
+        <w:t xml:space="preserve"> </w:t>
+      </w:r>
+      <w:r>
+        <w:t xml:space="preserve">(−29 mV versus SCAPS’s −5, direction matched). With the interface-plane states</w:t>
+      </w:r>
+      <w:r>
+        <w:t xml:space="preserve"> </w:t>
+      </w:r>
+      <w:r>
+        <w:t xml:space="preserve">active,</w:t>
       </w:r>
       <w:r>
         <w:t xml:space="preserve"> </w:t>
@@ -5266,25 +5342,70 @@
           <w:bCs/>
           <w:b/>
         </w:rPr>
+        <w:t xml:space="preserve">all eleven sweep directions reproduce SCAPS</w:t>
+      </w:r>
+      <w:r>
+        <w:t xml:space="preserve">; the two recovered</w:t>
+      </w:r>
+      <w:r>
+        <w:t xml:space="preserve"> </w:t>
+      </w:r>
+      <w:r>
+        <w:t xml:space="preserve">sweeps then over-respond in magnitude (the interface-plane channel is</w:t>
+      </w:r>
+      <w:r>
+        <w:t xml:space="preserve"> </w:t>
+      </w:r>
+      <w:r>
+        <w:t xml:space="preserve">over-strong — its carrier-density calibration is the named residual, scoped to</w:t>
+      </w:r>
+      <w:r>
+        <w:t xml:space="preserve"> </w:t>
+      </w:r>
+      <w:r>
+        <w:t xml:space="preserve">the steady-state interface-physics work).</w:t>
+      </w:r>
+    </w:p>
+    <w:p>
+      <w:pPr>
+        <w:pStyle w:val="BodyText"/>
+      </w:pPr>
+      <w:r>
+        <w:t xml:space="preserve">The</w:t>
+      </w:r>
+      <w:r>
+        <w:t xml:space="preserve"> </w:t>
+      </w:r>
+      <w:r>
+        <w:rPr>
+          <w:bCs/>
+          <w:b/>
+        </w:rPr>
         <w:t xml:space="preserve">trends</w:t>
       </w:r>
       <w:r>
         <w:t xml:space="preserve"> </w:t>
       </w:r>
       <w:r>
-        <w:t xml:space="preserve">reproduce faithfully in both modes — every sweep direction</w:t>
-      </w:r>
-      <w:r>
-        <w:t xml:space="preserve"> </w:t>
-      </w:r>
-      <w:r>
-        <w:t xml:space="preserve">matches, with magnitudes at 53–87 % of SCAPS through the interface-plane</w:t>
-      </w:r>
-      <w:r>
-        <w:t xml:space="preserve"> </w:t>
-      </w:r>
-      <w:r>
-        <w:t xml:space="preserve">sampling; the residual magnitude gap is SCAPS’s specific thermionic-emission /</w:t>
+        <w:t xml:space="preserve">therefore reproduce faithfully — every sweep direction</w:t>
+      </w:r>
+      <w:r>
+        <w:t xml:space="preserve"> </w:t>
+      </w:r>
+      <w:r>
+        <w:t xml:space="preserve">matches (the two interface-doping sweeps via the interface-plane states above),</w:t>
+      </w:r>
+      <w:r>
+        <w:t xml:space="preserve"> </w:t>
+      </w:r>
+      <w:r>
+        <w:t xml:space="preserve">with magnitudes at 53–87 % of SCAPS; the residual magnitude gap is SCAPS’s</w:t>
+      </w:r>
+      <w:r>
+        <w:t xml:space="preserve"> </w:t>
+      </w:r>
+      <w:r>
+        <w:t xml:space="preserve">specific thermionic-emission /</w:t>
       </w:r>
       <w:r>
         <w:t xml:space="preserve"> </w:t>

</xml_diff>

<commit_message>
docs(partner): regenerate Nd_ETL + HTL/PVK figures in interface-plane-states mode (directions now match SCAPS)
The two interface-doping sweeps reverse/flatten in direction on the fast
transient path (bulk-node interface sampling). Regenerated them through
the steady-state driver with interface-plane carrier states
(SOLARLAB_IFACE_STATES=1, 4 points/sweep): SolarLab V_oc now RISES with
ETL doping (0.80->1.16 V, tracking SCAPS 1.10->1.24) and DROPS with
HTL/PVK defect density (1.112->1.082, matching SCAPS's drop) -- both
directions reproduce SCAPS. The other nine figures stay faithful-default
mode; §4 caption notes the two interface figures' mode.

Adds SOLARLAB_FIG_NPTS point-subsampling to scaps_validation_figures.py
so the (slow) interface-plane-states figure path is tractable. PDF/DOCX
rebuilt (12 pages, 0 glyph warnings).
</commit_message>
<xml_diff>
--- a/docs/partner/SolarLab_SCAPS_validation_2026-06-11.docx
+++ b/docs/partner/SolarLab_SCAPS_validation_2026-06-11.docx
@@ -1389,7 +1389,7 @@
           <w:bCs/>
           <w:b/>
         </w:rPr>
-        <w:t xml:space="preserve">All figures and the Table 2</w:t>
+        <w:t xml:space="preserve">The figures and Table 2</w:t>
       </w:r>
       <w:r>
         <w:rPr>
@@ -1403,7 +1403,7 @@
           <w:bCs/>
           <w:b/>
         </w:rPr>
-        <w:t xml:space="preserve">scorecard below are the faithful-default mode</w:t>
+        <w:t xml:space="preserve">scorecard are the faithful-default mode</w:t>
       </w:r>
       <w:r>
         <w:t xml:space="preserve"> </w:t>
@@ -1493,7 +1493,37 @@
         <w:t xml:space="preserve"> </w:t>
       </w:r>
       <w:r>
-        <w:t xml:space="preserve">direction. Grouped by outcome (faithful default):</w:t>
+        <w:t xml:space="preserve">direction. (The two interface-doping figures — ETL donor doping and HTL/PVK</w:t>
+      </w:r>
+      <w:r>
+        <w:t xml:space="preserve"> </w:t>
+      </w:r>
+      <w:r>
+        <w:t xml:space="preserve">interface N</w:t>
+      </w:r>
+      <w:r>
+        <w:rPr>
+          <w:vertAlign w:val="subscript"/>
+        </w:rPr>
+        <w:t xml:space="preserve">t</w:t>
+      </w:r>
+      <w:r>
+        <w:t xml:space="preserve"> </w:t>
+      </w:r>
+      <w:r>
+        <w:t xml:space="preserve">— are shown in the interface-plane-states mode, where their</w:t>
+      </w:r>
+      <w:r>
+        <w:t xml:space="preserve"> </w:t>
+      </w:r>
+      <w:r>
+        <w:t xml:space="preserve">direction reverses to match SCAPS as explained in Section 5.z; on the faithful</w:t>
+      </w:r>
+      <w:r>
+        <w:t xml:space="preserve"> </w:t>
+      </w:r>
+      <w:r>
+        <w:t xml:space="preserve">transient path those two flatten/reverse.) Grouped by outcome (faithful default):</w:t>
       </w:r>
     </w:p>
     <w:p>

</xml_diff>